<commit_message>
Added new data, scripts, notebooks, and resources for the Uganda Fake News Detection project. This includes cleaned datasets, model predictions, exploratory data analysis, and various reports documenting the progress and findings of the project. Additionally, some files were modified to update existing content and ensure the project's continuity.
</commit_message>
<xml_diff>
--- a/resource/Summary Report for Preliminary Data Validation and Baseline Model Evaluation.docx
+++ b/resource/Summary Report for Preliminary Data Validation and Baseline Model Evaluation.docx
@@ -693,25 +693,7 @@
           <w:sz w:val="28"/>
           <w:szCs w:val="28"/>
         </w:rPr>
-        <w:t xml:space="preserve">) to ensure reproducibility and data integrity </w:t>
-      </w:r>
-      <w:proofErr w:type="gramStart"/>
-      <w:r>
-        <w:rPr>
-          <w:rFonts w:ascii="Times New Roman" w:eastAsia="Times New Roman" w:hAnsi="Times New Roman" w:cs="Times New Roman"/>
-          <w:sz w:val="28"/>
-          <w:szCs w:val="28"/>
-        </w:rPr>
-        <w:t>throughout</w:t>
-      </w:r>
-      <w:proofErr w:type="gramEnd"/>
-      <w:r>
-        <w:rPr>
-          <w:rFonts w:ascii="Times New Roman" w:eastAsia="Times New Roman" w:hAnsi="Times New Roman" w:cs="Times New Roman"/>
-          <w:sz w:val="28"/>
-          <w:szCs w:val="28"/>
-        </w:rPr>
-        <w:t xml:space="preserve"> the research.</w:t>
+        <w:t>) to ensure reproducibility and data integrity throughout the research.</w:t>
       </w:r>
     </w:p>
     <w:p>
@@ -1123,6 +1105,78 @@
     <w:p>
       <w:pPr>
         <w:spacing w:before="100" w:beforeAutospacing="1" w:after="100" w:afterAutospacing="1" w:line="240" w:lineRule="auto"/>
+        <w:rPr>
+          <w:rFonts w:ascii="Times New Roman" w:hAnsi="Times New Roman" w:cs="Times New Roman"/>
+          <w:sz w:val="28"/>
+          <w:szCs w:val="28"/>
+        </w:rPr>
+      </w:pPr>
+      <w:r>
+        <w:rPr>
+          <w:rFonts w:ascii="Times New Roman" w:hAnsi="Times New Roman" w:cs="Times New Roman"/>
+          <w:sz w:val="28"/>
+          <w:szCs w:val="28"/>
+        </w:rPr>
+        <w:t xml:space="preserve">Feature importance analysis revealed that fake news texts frequently contained politically charged and sensational terms such as </w:t>
+      </w:r>
+      <w:r>
+        <w:rPr>
+          <w:rStyle w:val="Emphasis"/>
+          <w:rFonts w:ascii="Times New Roman" w:hAnsi="Times New Roman" w:cs="Times New Roman"/>
+          <w:sz w:val="28"/>
+          <w:szCs w:val="28"/>
+        </w:rPr>
+        <w:t>‘Uganda government’, ‘climate’, and ‘healthcare’</w:t>
+      </w:r>
+      <w:r>
+        <w:rPr>
+          <w:rFonts w:ascii="Times New Roman" w:hAnsi="Times New Roman" w:cs="Times New Roman"/>
+          <w:sz w:val="28"/>
+          <w:szCs w:val="28"/>
+        </w:rPr>
+        <w:t xml:space="preserve">, while legitimate news contained fact-checking and verification-related terms including </w:t>
+      </w:r>
+      <w:r>
+        <w:rPr>
+          <w:rStyle w:val="Emphasis"/>
+          <w:rFonts w:ascii="Times New Roman" w:hAnsi="Times New Roman" w:cs="Times New Roman"/>
+          <w:sz w:val="28"/>
+          <w:szCs w:val="28"/>
+        </w:rPr>
+        <w:t>‘opposition’, ‘altered’, ‘photo’, and ‘false’</w:t>
+      </w:r>
+      <w:r>
+        <w:rPr>
+          <w:rFonts w:ascii="Times New Roman" w:hAnsi="Times New Roman" w:cs="Times New Roman"/>
+          <w:sz w:val="28"/>
+          <w:szCs w:val="28"/>
+        </w:rPr>
+        <w:t>. This demonstrates that the model effectively learned meaningful lexical patterns that distinguish misinformation from authentic news content</w:t>
+      </w:r>
+    </w:p>
+    <w:p>
+      <w:pPr>
+        <w:spacing w:before="100" w:beforeAutospacing="1" w:after="100" w:afterAutospacing="1" w:line="240" w:lineRule="auto"/>
+        <w:rPr>
+          <w:rFonts w:ascii="Times New Roman" w:hAnsi="Times New Roman" w:cs="Times New Roman"/>
+          <w:sz w:val="28"/>
+          <w:szCs w:val="28"/>
+        </w:rPr>
+      </w:pPr>
+    </w:p>
+    <w:p>
+      <w:pPr>
+        <w:spacing w:before="100" w:beforeAutospacing="1" w:after="100" w:afterAutospacing="1" w:line="240" w:lineRule="auto"/>
+        <w:rPr>
+          <w:rFonts w:ascii="Times New Roman" w:eastAsia="Times New Roman" w:hAnsi="Times New Roman" w:cs="Times New Roman"/>
+          <w:sz w:val="28"/>
+          <w:szCs w:val="28"/>
+        </w:rPr>
+      </w:pPr>
+    </w:p>
+    <w:p>
+      <w:pPr>
+        <w:spacing w:before="100" w:beforeAutospacing="1" w:after="100" w:afterAutospacing="1" w:line="240" w:lineRule="auto"/>
         <w:outlineLvl w:val="2"/>
         <w:rPr>
           <w:rFonts w:ascii="Times New Roman" w:eastAsia="Times New Roman" w:hAnsi="Times New Roman" w:cs="Times New Roman"/>
@@ -1140,8 +1194,11 @@
           <w:sz w:val="28"/>
           <w:szCs w:val="28"/>
         </w:rPr>
+        <w:lastRenderedPageBreak/>
         <w:t>6. Model Evaluation Results</w:t>
       </w:r>
+      <w:bookmarkStart w:id="0" w:name="_GoBack"/>
+      <w:bookmarkEnd w:id="0"/>
     </w:p>
     <w:p>
       <w:pPr>
@@ -1304,16 +1361,7 @@
           <w:sz w:val="28"/>
           <w:szCs w:val="28"/>
         </w:rPr>
-        <w:t xml:space="preserve">The classification report demonstrated balanced performance across both fake and true news classes. The confusion matrix revealed a low number of </w:t>
-      </w:r>
-      <w:r>
-        <w:rPr>
-          <w:rFonts w:ascii="Times New Roman" w:eastAsia="Times New Roman" w:hAnsi="Times New Roman" w:cs="Times New Roman"/>
-          <w:sz w:val="28"/>
-          <w:szCs w:val="28"/>
-        </w:rPr>
-        <w:lastRenderedPageBreak/>
-        <w:t>misclassifications, indicating strong generalization and minimal bias.</w:t>
+        <w:t>The classification report demonstrated balanced performance across both fake and true news classes. The confusion matrix revealed a low number of misclassifications, indicating strong generalization and minimal bias.</w:t>
       </w:r>
       <w:r>
         <w:rPr>
@@ -1474,6 +1522,7 @@
           <w:sz w:val="28"/>
           <w:szCs w:val="28"/>
         </w:rPr>
+        <w:lastRenderedPageBreak/>
         <w:t>The model successfully learned meaningful linguistic patterns distinguishing fake from true news.</w:t>
       </w:r>
     </w:p>
@@ -1573,7 +1622,6 @@
           <w:sz w:val="28"/>
           <w:szCs w:val="28"/>
         </w:rPr>
-        <w:lastRenderedPageBreak/>
         <w:t>8. Limitations</w:t>
       </w:r>
     </w:p>
@@ -1740,6 +1788,7 @@
           <w:sz w:val="28"/>
           <w:szCs w:val="28"/>
         </w:rPr>
+        <w:lastRenderedPageBreak/>
         <w:drawing>
           <wp:inline distT="0" distB="0" distL="0" distR="0">
             <wp:extent cx="5221234" cy="4489713"/>
@@ -1808,17 +1857,14 @@
           <w:szCs w:val="28"/>
         </w:rPr>
       </w:pPr>
-      <w:bookmarkStart w:id="0" w:name="_GoBack"/>
-      <w:bookmarkEnd w:id="0"/>
-      <w:r>
-        <w:rPr>
-          <w:rFonts w:ascii="Times New Roman" w:eastAsia="Times New Roman" w:hAnsi="Times New Roman" w:cs="Times New Roman"/>
-          <w:b/>
-          <w:bCs/>
-          <w:sz w:val="28"/>
-          <w:szCs w:val="28"/>
-        </w:rPr>
-        <w:lastRenderedPageBreak/>
+      <w:r>
+        <w:rPr>
+          <w:rFonts w:ascii="Times New Roman" w:eastAsia="Times New Roman" w:hAnsi="Times New Roman" w:cs="Times New Roman"/>
+          <w:b/>
+          <w:bCs/>
+          <w:sz w:val="28"/>
+          <w:szCs w:val="28"/>
+        </w:rPr>
         <w:t>9. Conclusion</w:t>
       </w:r>
     </w:p>
@@ -1962,6 +2008,7 @@
           <w:sz w:val="28"/>
           <w:szCs w:val="28"/>
         </w:rPr>
+        <w:lastRenderedPageBreak/>
         <w:drawing>
           <wp:inline distT="0" distB="0" distL="0" distR="0">
             <wp:extent cx="5285242" cy="4069088"/>
@@ -3763,6 +3810,17 @@
       <w:szCs w:val="20"/>
     </w:rPr>
   </w:style>
+  <w:style w:type="character" w:styleId="Emphasis">
+    <w:name w:val="Emphasis"/>
+    <w:basedOn w:val="DefaultParagraphFont"/>
+    <w:uiPriority w:val="20"/>
+    <w:qFormat/>
+    <w:rsid w:val="00AC241E"/>
+    <w:rPr>
+      <w:i/>
+      <w:iCs/>
+    </w:rPr>
+  </w:style>
 </w:styles>
 </file>
 
@@ -4032,7 +4090,7 @@
 </file>
 
 <file path=customXml/itemProps1.xml><?xml version="1.0" encoding="utf-8"?>
-<ds:datastoreItem xmlns:ds="http://schemas.openxmlformats.org/officeDocument/2006/customXml" ds:itemID="{F583B858-A840-4B75-ACBB-443BC32B197E}">
+<ds:datastoreItem xmlns:ds="http://schemas.openxmlformats.org/officeDocument/2006/customXml" ds:itemID="{4954B6E6-345D-4721-940E-98FA92AE3750}">
   <ds:schemaRefs>
     <ds:schemaRef ds:uri="http://schemas.openxmlformats.org/officeDocument/2006/bibliography"/>
   </ds:schemaRefs>

</xml_diff>